<commit_message>
feat: implement dynamic Chart.js theme adjustments and add missing CSS overrides for light theme readability (hover effects, badges, location markers)
</commit_message>
<xml_diff>
--- a/(สะสมองค์กร) ขออนุมัติเบิกค่าใช้จ่ายโครงการทิศทางแห่งเฟรชชี่ (The freshy bearing) สะสม.docx
+++ b/(สะสมองค์กร) ขออนุมัติเบิกค่าใช้จ่ายโครงการทิศทางแห่งเฟรชชี่ (The freshy bearing) สะสม.docx
@@ -303,6 +303,7 @@
           <w:color w:val="000000" w:themeColor="text1"/>
           <w:sz w:val="24"/>
           <w:szCs w:val="24"/>
+          <w:highlight w:val="yellow"/>
           <w:cs/>
         </w:rPr>
         <w:t>วันที่ 3 กรกฎาคม 2569</w:t>
@@ -1084,7 +1085,29 @@
                                 <w:szCs w:val="22"/>
                                 <w:cs/>
                               </w:rPr>
-                              <w:t>นายธนวัฒน์ เตชะอำไพ</w:t>
+                              <w:t xml:space="preserve">นายธนวัฒน์ </w:t>
+                            </w:r>
+                            <w:proofErr w:type="spellStart"/>
+                            <w:r>
+                              <w:rPr>
+                                <w:rFonts w:ascii="TH SarabunPSK" w:hAnsi="TH SarabunPSK" w:cs="TH SarabunPSK"/>
+                                <w:caps/>
+                                <w:sz w:val="22"/>
+                                <w:szCs w:val="22"/>
+                                <w:cs/>
+                              </w:rPr>
+                              <w:t>เต</w:t>
+                            </w:r>
+                            <w:proofErr w:type="spellEnd"/>
+                            <w:r>
+                              <w:rPr>
+                                <w:rFonts w:ascii="TH SarabunPSK" w:hAnsi="TH SarabunPSK" w:cs="TH SarabunPSK"/>
+                                <w:caps/>
+                                <w:sz w:val="22"/>
+                                <w:szCs w:val="22"/>
+                                <w:cs/>
+                              </w:rPr>
+                              <w:t>ชะอำไพ</w:t>
                             </w:r>
                             <w:r>
                               <w:rPr>
@@ -1211,7 +1234,29 @@
                           <w:szCs w:val="22"/>
                           <w:cs/>
                         </w:rPr>
-                        <w:t>นายธนวัฒน์ เตชะอำไพ</w:t>
+                        <w:t xml:space="preserve">นายธนวัฒน์ </w:t>
+                      </w:r>
+                      <w:proofErr w:type="spellStart"/>
+                      <w:r>
+                        <w:rPr>
+                          <w:rFonts w:ascii="TH SarabunPSK" w:hAnsi="TH SarabunPSK" w:cs="TH SarabunPSK"/>
+                          <w:caps/>
+                          <w:sz w:val="22"/>
+                          <w:szCs w:val="22"/>
+                          <w:cs/>
+                        </w:rPr>
+                        <w:t>เต</w:t>
+                      </w:r>
+                      <w:proofErr w:type="spellEnd"/>
+                      <w:r>
+                        <w:rPr>
+                          <w:rFonts w:ascii="TH SarabunPSK" w:hAnsi="TH SarabunPSK" w:cs="TH SarabunPSK"/>
+                          <w:caps/>
+                          <w:sz w:val="22"/>
+                          <w:szCs w:val="22"/>
+                          <w:cs/>
+                        </w:rPr>
+                        <w:t>ชะอำไพ</w:t>
                       </w:r>
                       <w:r>
                         <w:rPr>
@@ -1358,8 +1403,20 @@
                                 <w:szCs w:val="20"/>
                                 <w:cs/>
                               </w:rPr>
-                              <w:t>นายอภิสิทธิ์ มังกรคุนธี</w:t>
+                              <w:t>นายอภิสิทธิ์ มังกร</w:t>
                             </w:r>
+                            <w:proofErr w:type="spellStart"/>
+                            <w:r>
+                              <w:rPr>
+                                <w:rFonts w:hint="cs"/>
+                                <w:caps/>
+                                <w:sz w:val="20"/>
+                                <w:szCs w:val="20"/>
+                                <w:cs/>
+                              </w:rPr>
+                              <w:t>คุนธี</w:t>
+                            </w:r>
+                            <w:proofErr w:type="spellEnd"/>
                             <w:r>
                               <w:rPr>
                                 <w:rFonts w:hint="cs"/>
@@ -1478,8 +1535,20 @@
                           <w:szCs w:val="20"/>
                           <w:cs/>
                         </w:rPr>
-                        <w:t>นายอภิสิทธิ์ มังกรคุนธี</w:t>
+                        <w:t>นายอภิสิทธิ์ มังกร</w:t>
                       </w:r>
+                      <w:proofErr w:type="spellStart"/>
+                      <w:r>
+                        <w:rPr>
+                          <w:rFonts w:hint="cs"/>
+                          <w:caps/>
+                          <w:sz w:val="20"/>
+                          <w:szCs w:val="20"/>
+                          <w:cs/>
+                        </w:rPr>
+                        <w:t>คุนธี</w:t>
+                      </w:r>
+                      <w:proofErr w:type="spellEnd"/>
                       <w:r>
                         <w:rPr>
                           <w:rFonts w:hint="cs"/>
@@ -2158,7 +2227,29 @@
                 <w:szCs w:val="24"/>
                 <w:cs/>
               </w:rPr>
-              <w:t xml:space="preserve">ใบเสร็จรับเงิน บริษัท เอส แอนด์ พี ซินดิเคท จำกัด (มหาชน) เลขที่ </w:t>
+              <w:t>ใบเสร็จรับเงิน บริษัท เอส แอนด์ พี ซิน</w:t>
+            </w:r>
+            <w:proofErr w:type="spellStart"/>
+            <w:r>
+              <w:rPr>
+                <w:rFonts w:hint="cs"/>
+                <w:color w:val="000000" w:themeColor="text1"/>
+                <w:sz w:val="24"/>
+                <w:szCs w:val="24"/>
+                <w:cs/>
+              </w:rPr>
+              <w:t>ดิ</w:t>
+            </w:r>
+            <w:proofErr w:type="spellEnd"/>
+            <w:r>
+              <w:rPr>
+                <w:rFonts w:hint="cs"/>
+                <w:color w:val="000000" w:themeColor="text1"/>
+                <w:sz w:val="24"/>
+                <w:szCs w:val="24"/>
+                <w:cs/>
+              </w:rPr>
+              <w:t xml:space="preserve">เคท จำกัด (มหาชน) เลขที่ </w:t>
             </w:r>
             <w:r>
               <w:rPr>
@@ -2496,7 +2587,29 @@
                 <w:szCs w:val="24"/>
                 <w:cs/>
               </w:rPr>
-              <w:t xml:space="preserve">ใบเสร็จรับเงิน บมจ. ซีพี ออลล์ เลขที่ </w:t>
+              <w:t>ใบเสร็จรับเงิน บมจ. ซีพี ออ</w:t>
+            </w:r>
+            <w:proofErr w:type="spellStart"/>
+            <w:r>
+              <w:rPr>
+                <w:rFonts w:hint="cs"/>
+                <w:color w:val="000000" w:themeColor="text1"/>
+                <w:sz w:val="24"/>
+                <w:szCs w:val="24"/>
+                <w:cs/>
+              </w:rPr>
+              <w:t>ลล์</w:t>
+            </w:r>
+            <w:proofErr w:type="spellEnd"/>
+            <w:r>
+              <w:rPr>
+                <w:rFonts w:hint="cs"/>
+                <w:color w:val="000000" w:themeColor="text1"/>
+                <w:sz w:val="24"/>
+                <w:szCs w:val="24"/>
+                <w:cs/>
+              </w:rPr>
+              <w:t xml:space="preserve"> เลขที่ </w:t>
             </w:r>
             <w:r>
               <w:rPr>
@@ -2633,7 +2746,29 @@
                 <w:szCs w:val="24"/>
                 <w:cs/>
               </w:rPr>
-              <w:t xml:space="preserve">ใบเสร็จรับเงิน บมจ. ซีพี ออลล์ เลขที่ </w:t>
+              <w:t>ใบเสร็จรับเงิน บมจ. ซีพี ออ</w:t>
+            </w:r>
+            <w:proofErr w:type="spellStart"/>
+            <w:r>
+              <w:rPr>
+                <w:rFonts w:hint="cs"/>
+                <w:color w:val="000000" w:themeColor="text1"/>
+                <w:sz w:val="24"/>
+                <w:szCs w:val="24"/>
+                <w:cs/>
+              </w:rPr>
+              <w:t>ลล์</w:t>
+            </w:r>
+            <w:proofErr w:type="spellEnd"/>
+            <w:r>
+              <w:rPr>
+                <w:rFonts w:hint="cs"/>
+                <w:color w:val="000000" w:themeColor="text1"/>
+                <w:sz w:val="24"/>
+                <w:szCs w:val="24"/>
+                <w:cs/>
+              </w:rPr>
+              <w:t xml:space="preserve"> เลขที่ </w:t>
             </w:r>
             <w:r>
               <w:rPr>
@@ -2790,7 +2925,29 @@
                 <w:szCs w:val="24"/>
                 <w:cs/>
               </w:rPr>
-              <w:t xml:space="preserve">ใบเสร็จรับเงิน บมจ. ซีพี ออลล์ เลขที่ </w:t>
+              <w:t>ใบเสร็จรับเงิน บมจ. ซีพี ออ</w:t>
+            </w:r>
+            <w:proofErr w:type="spellStart"/>
+            <w:r>
+              <w:rPr>
+                <w:rFonts w:hint="cs"/>
+                <w:color w:val="000000" w:themeColor="text1"/>
+                <w:sz w:val="24"/>
+                <w:szCs w:val="24"/>
+                <w:cs/>
+              </w:rPr>
+              <w:t>ลล์</w:t>
+            </w:r>
+            <w:proofErr w:type="spellEnd"/>
+            <w:r>
+              <w:rPr>
+                <w:rFonts w:hint="cs"/>
+                <w:color w:val="000000" w:themeColor="text1"/>
+                <w:sz w:val="24"/>
+                <w:szCs w:val="24"/>
+                <w:cs/>
+              </w:rPr>
+              <w:t xml:space="preserve"> เลขที่ </w:t>
             </w:r>
             <w:r>
               <w:rPr>
@@ -3052,7 +3209,29 @@
                 <w:szCs w:val="24"/>
                 <w:cs/>
               </w:rPr>
-              <w:t>ใบสำคัญรับเงิน นางสาวภัทราพร เทิดลีมีชัย ลงวันที่ 27 มิถุนายน 2569</w:t>
+              <w:t>ใบสำคัญรับเงิน นางสาว</w:t>
+            </w:r>
+            <w:proofErr w:type="spellStart"/>
+            <w:r>
+              <w:rPr>
+                <w:rFonts w:hint="cs"/>
+                <w:color w:val="000000" w:themeColor="text1"/>
+                <w:sz w:val="24"/>
+                <w:szCs w:val="24"/>
+                <w:cs/>
+              </w:rPr>
+              <w:t>ภัท</w:t>
+            </w:r>
+            <w:proofErr w:type="spellEnd"/>
+            <w:r>
+              <w:rPr>
+                <w:rFonts w:hint="cs"/>
+                <w:color w:val="000000" w:themeColor="text1"/>
+                <w:sz w:val="24"/>
+                <w:szCs w:val="24"/>
+                <w:cs/>
+              </w:rPr>
+              <w:t>ราพร เทิดลีมีชัย ลงวันที่ 27 มิถุนายน 2569</w:t>
             </w:r>
           </w:p>
         </w:tc>
@@ -3167,7 +3346,29 @@
                 <w:szCs w:val="24"/>
                 <w:cs/>
               </w:rPr>
-              <w:t>ใบสำคัญรับเงิน นายทัตเชษฐ์ พินิจมนตรี ลงวันที่ 27 มิถุนายน 2569</w:t>
+              <w:t>ใบสำคัญรับเงิน นาย</w:t>
+            </w:r>
+            <w:proofErr w:type="spellStart"/>
+            <w:r>
+              <w:rPr>
+                <w:rFonts w:hint="cs"/>
+                <w:color w:val="000000" w:themeColor="text1"/>
+                <w:sz w:val="24"/>
+                <w:szCs w:val="24"/>
+                <w:cs/>
+              </w:rPr>
+              <w:t>ทัตเชษฐ์</w:t>
+            </w:r>
+            <w:proofErr w:type="spellEnd"/>
+            <w:r>
+              <w:rPr>
+                <w:rFonts w:hint="cs"/>
+                <w:color w:val="000000" w:themeColor="text1"/>
+                <w:sz w:val="24"/>
+                <w:szCs w:val="24"/>
+                <w:cs/>
+              </w:rPr>
+              <w:t xml:space="preserve"> พินิจมนตรี ลงวันที่ 27 มิถุนายน 2569</w:t>
             </w:r>
           </w:p>
         </w:tc>
@@ -3277,7 +3478,29 @@
                 <w:szCs w:val="24"/>
                 <w:cs/>
               </w:rPr>
-              <w:t>ใบสำคัญรับเงิน นายทัตเชษฐ์ พินิจมนตรี ลงวันที่ 2 กรกฎาคม 2569</w:t>
+              <w:t>ใบสำคัญรับเงิน นาย</w:t>
+            </w:r>
+            <w:proofErr w:type="spellStart"/>
+            <w:r>
+              <w:rPr>
+                <w:rFonts w:hint="cs"/>
+                <w:color w:val="000000" w:themeColor="text1"/>
+                <w:sz w:val="24"/>
+                <w:szCs w:val="24"/>
+                <w:cs/>
+              </w:rPr>
+              <w:t>ทัตเชษฐ์</w:t>
+            </w:r>
+            <w:proofErr w:type="spellEnd"/>
+            <w:r>
+              <w:rPr>
+                <w:rFonts w:hint="cs"/>
+                <w:color w:val="000000" w:themeColor="text1"/>
+                <w:sz w:val="24"/>
+                <w:szCs w:val="24"/>
+                <w:cs/>
+              </w:rPr>
+              <w:t xml:space="preserve"> พินิจมนตรี ลงวันที่ 2 กรกฎาคม 2569</w:t>
             </w:r>
           </w:p>
         </w:tc>
@@ -3388,7 +3611,51 @@
                 <w:szCs w:val="24"/>
                 <w:cs/>
               </w:rPr>
-              <w:t>ใบสำคัญรับเงิน นายณัฐสิษฐ์ ธิปภาดา ลงวันที่ 2 กรกฎาคม 2569</w:t>
+              <w:t>ใบสำคัญรับเงิน นายณัฐ</w:t>
+            </w:r>
+            <w:proofErr w:type="spellStart"/>
+            <w:r>
+              <w:rPr>
+                <w:rFonts w:hint="cs"/>
+                <w:color w:val="000000" w:themeColor="text1"/>
+                <w:sz w:val="24"/>
+                <w:szCs w:val="24"/>
+                <w:cs/>
+              </w:rPr>
+              <w:t>สิษฐ์</w:t>
+            </w:r>
+            <w:proofErr w:type="spellEnd"/>
+            <w:r>
+              <w:rPr>
+                <w:rFonts w:hint="cs"/>
+                <w:color w:val="000000" w:themeColor="text1"/>
+                <w:sz w:val="24"/>
+                <w:szCs w:val="24"/>
+                <w:cs/>
+              </w:rPr>
+              <w:t xml:space="preserve"> </w:t>
+            </w:r>
+            <w:proofErr w:type="spellStart"/>
+            <w:r>
+              <w:rPr>
+                <w:rFonts w:hint="cs"/>
+                <w:color w:val="000000" w:themeColor="text1"/>
+                <w:sz w:val="24"/>
+                <w:szCs w:val="24"/>
+                <w:cs/>
+              </w:rPr>
+              <w:t>ธิป</w:t>
+            </w:r>
+            <w:proofErr w:type="spellEnd"/>
+            <w:r>
+              <w:rPr>
+                <w:rFonts w:hint="cs"/>
+                <w:color w:val="000000" w:themeColor="text1"/>
+                <w:sz w:val="24"/>
+                <w:szCs w:val="24"/>
+                <w:cs/>
+              </w:rPr>
+              <w:t>ภาดา ลงวันที่ 2 กรกฎาคม 2569</w:t>
             </w:r>
             <w:r>
               <w:rPr>
@@ -3836,42 +4103,21 @@
               <w:spacing w:line="240" w:lineRule="auto"/>
               <w:jc w:val="both"/>
               <w:rPr>
-                <w:rFonts w:hint="cs"/>
-                <w:color w:val="000000" w:themeColor="text1"/>
-                <w:sz w:val="24"/>
-                <w:szCs w:val="24"/>
-                <w:cs/>
-              </w:rPr>
-            </w:pPr>
-            <w:r>
-              <w:rPr>
-                <w:rFonts w:hint="cs"/>
-                <w:color w:val="000000" w:themeColor="text1"/>
-                <w:sz w:val="24"/>
-                <w:szCs w:val="24"/>
-                <w:cs/>
-              </w:rPr>
-              <w:t xml:space="preserve">ใบสำคัญรับเงิน </w:t>
-            </w:r>
-            <w:r>
-              <w:rPr>
-                <w:rFonts w:hint="cs"/>
-                <w:color w:val="000000" w:themeColor="text1"/>
-                <w:sz w:val="24"/>
-                <w:szCs w:val="24"/>
-                <w:cs/>
-              </w:rPr>
-              <w:t>นางสาวจิราภรณ์ หลีใจ</w:t>
-            </w:r>
-            <w:r>
-              <w:rPr>
-                <w:rFonts w:hint="cs"/>
-                <w:color w:val="000000" w:themeColor="text1"/>
-                <w:sz w:val="24"/>
-                <w:szCs w:val="24"/>
-                <w:cs/>
-              </w:rPr>
-              <w:t xml:space="preserve"> ลงวันที่ 2 กรกฎาคม 2569</w:t>
+                <w:color w:val="000000" w:themeColor="text1"/>
+                <w:sz w:val="24"/>
+                <w:szCs w:val="24"/>
+                <w:cs/>
+              </w:rPr>
+            </w:pPr>
+            <w:r>
+              <w:rPr>
+                <w:rFonts w:hint="cs"/>
+                <w:color w:val="000000" w:themeColor="text1"/>
+                <w:sz w:val="24"/>
+                <w:szCs w:val="24"/>
+                <w:cs/>
+              </w:rPr>
+              <w:t>ใบสำคัญรับเงิน นางสาวจิราภรณ์ หลีใจ ลงวันที่ 2 กรกฎาคม 2569</w:t>
             </w:r>
           </w:p>
         </w:tc>
@@ -3893,7 +4139,6 @@
               </w:tabs>
               <w:jc w:val="right"/>
               <w:rPr>
-                <w:rFonts w:hint="cs"/>
                 <w:color w:val="000000" w:themeColor="text1"/>
                 <w:sz w:val="24"/>
                 <w:szCs w:val="24"/>
@@ -3930,7 +4175,6 @@
               </w:tabs>
               <w:jc w:val="right"/>
               <w:rPr>
-                <w:rFonts w:hint="cs"/>
                 <w:color w:val="000000" w:themeColor="text1"/>
                 <w:sz w:val="24"/>
                 <w:szCs w:val="24"/>
@@ -4234,7 +4478,6 @@
             <w:pPr>
               <w:jc w:val="right"/>
               <w:rPr>
-                <w:rFonts w:hint="cs"/>
                 <w:b/>
                 <w:bCs/>
                 <w:color w:val="000000" w:themeColor="text1"/>
@@ -4508,6 +4751,100 @@
           <w:szCs w:val="24"/>
         </w:rPr>
       </w:pPr>
+    </w:p>
+    <w:p>
+      <w:pPr>
+        <w:tabs>
+          <w:tab w:val="left" w:pos="1246"/>
+        </w:tabs>
+        <w:jc w:val="both"/>
+        <w:rPr>
+          <w:sz w:val="24"/>
+          <w:szCs w:val="24"/>
+        </w:rPr>
+      </w:pPr>
+    </w:p>
+    <w:p>
+      <w:pPr>
+        <w:tabs>
+          <w:tab w:val="left" w:pos="1246"/>
+        </w:tabs>
+        <w:jc w:val="both"/>
+        <w:rPr>
+          <w:sz w:val="24"/>
+          <w:szCs w:val="24"/>
+        </w:rPr>
+      </w:pPr>
+    </w:p>
+    <w:p>
+      <w:pPr>
+        <w:tabs>
+          <w:tab w:val="left" w:pos="1246"/>
+        </w:tabs>
+        <w:jc w:val="both"/>
+        <w:rPr>
+          <w:sz w:val="24"/>
+          <w:szCs w:val="24"/>
+        </w:rPr>
+      </w:pPr>
+    </w:p>
+    <w:p>
+      <w:pPr>
+        <w:tabs>
+          <w:tab w:val="left" w:pos="1246"/>
+        </w:tabs>
+        <w:jc w:val="both"/>
+        <w:rPr>
+          <w:sz w:val="24"/>
+          <w:szCs w:val="24"/>
+        </w:rPr>
+      </w:pPr>
+    </w:p>
+    <w:p>
+      <w:pPr>
+        <w:tabs>
+          <w:tab w:val="left" w:pos="1246"/>
+        </w:tabs>
+        <w:jc w:val="both"/>
+        <w:rPr>
+          <w:sz w:val="24"/>
+          <w:szCs w:val="24"/>
+        </w:rPr>
+      </w:pPr>
+    </w:p>
+    <w:p>
+      <w:pPr>
+        <w:tabs>
+          <w:tab w:val="left" w:pos="1246"/>
+        </w:tabs>
+        <w:jc w:val="both"/>
+        <w:rPr>
+          <w:sz w:val="24"/>
+          <w:szCs w:val="24"/>
+        </w:rPr>
+      </w:pPr>
+    </w:p>
+    <w:p>
+      <w:pPr>
+        <w:tabs>
+          <w:tab w:val="left" w:pos="1246"/>
+        </w:tabs>
+        <w:jc w:val="both"/>
+        <w:rPr>
+          <w:rFonts w:hint="cs"/>
+          <w:sz w:val="24"/>
+          <w:szCs w:val="24"/>
+        </w:rPr>
+      </w:pPr>
+      <w:r>
+        <w:rPr>
+          <w:sz w:val="24"/>
+          <w:szCs w:val="24"/>
+          <w:cs/>
+        </w:rPr>
+        <w:lastRenderedPageBreak/>
+        <w:tab/>
+      </w:r>
     </w:p>
     <w:sectPr>
       <w:pgSz w:w="12240" w:h="15840"/>
@@ -5280,6 +5617,7 @@
   <w:style w:type="character" w:default="1" w:styleId="DefaultParagraphFont">
     <w:name w:val="Default Paragraph Font"/>
     <w:uiPriority w:val="1"/>
+    <w:semiHidden/>
     <w:unhideWhenUsed/>
   </w:style>
   <w:style w:type="table" w:default="1" w:styleId="TableNormal">

</xml_diff>

<commit_message>
fix: restore original chocolate brown theme (#1e1914) with starry sky for horizontal staff boarding pass ticket
</commit_message>
<xml_diff>
--- a/(สะสมองค์กร) ขออนุมัติเบิกค่าใช้จ่ายโครงการทิศทางแห่งเฟรชชี่ (The freshy bearing) สะสม.docx
+++ b/(สะสมองค์กร) ขออนุมัติเบิกค่าใช้จ่ายโครงการทิศทางแห่งเฟรชชี่ (The freshy bearing) สะสม.docx
@@ -288,25 +288,32 @@
         <w:spacing w:after="0" w:line="240" w:lineRule="auto"/>
         <w:ind w:left="-540"/>
         <w:jc w:val="center"/>
-        <w:textAlignment w:val="baseline"/>
+        <w:rPr>
+          <w:rFonts w:eastAsia="Times New Roman" w:hint="cs"/>
+          <w:color w:val="000000" w:themeColor="text1"/>
+          <w:sz w:val="24"/>
+          <w:szCs w:val="24"/>
+          <w:cs/>
+        </w:rPr>
+      </w:pPr>
+      <w:r>
         <w:rPr>
           <w:rFonts w:eastAsia="Times New Roman"/>
           <w:color w:val="000000" w:themeColor="text1"/>
           <w:sz w:val="24"/>
           <w:szCs w:val="24"/>
-          <w:cs/>
-        </w:rPr>
-      </w:pPr>
+        </w:rPr>
+        <w:t xml:space="preserve">14 </w:t>
+      </w:r>
       <w:r>
         <w:rPr>
           <w:rFonts w:eastAsia="Times New Roman" w:hint="cs"/>
           <w:color w:val="000000" w:themeColor="text1"/>
           <w:sz w:val="24"/>
           <w:szCs w:val="24"/>
-          <w:highlight w:val="yellow"/>
           <w:cs/>
         </w:rPr>
-        <w:t>วันที่ 3 กรกฎาคม 2569</w:t>
+        <w:t>กรกฎาคม 2569</w:t>
       </w:r>
     </w:p>
     <w:p>
@@ -4823,28 +4830,6 @@
           <w:szCs w:val="24"/>
         </w:rPr>
       </w:pPr>
-    </w:p>
-    <w:p>
-      <w:pPr>
-        <w:tabs>
-          <w:tab w:val="left" w:pos="1246"/>
-        </w:tabs>
-        <w:jc w:val="both"/>
-        <w:rPr>
-          <w:rFonts w:hint="cs"/>
-          <w:sz w:val="24"/>
-          <w:szCs w:val="24"/>
-        </w:rPr>
-      </w:pPr>
-      <w:r>
-        <w:rPr>
-          <w:sz w:val="24"/>
-          <w:szCs w:val="24"/>
-          <w:cs/>
-        </w:rPr>
-        <w:lastRenderedPageBreak/>
-        <w:tab/>
-      </w:r>
     </w:p>
     <w:sectPr>
       <w:pgSz w:w="12240" w:h="15840"/>

</xml_diff>

<commit_message>
fix: restore dynamic morning/afternoon session slots on student ticket stubs instead of hardcoded evening concert
</commit_message>
<xml_diff>
--- a/(สะสมองค์กร) ขออนุมัติเบิกค่าใช้จ่ายโครงการทิศทางแห่งเฟรชชี่ (The freshy bearing) สะสม.docx
+++ b/(สะสมองค์กร) ขออนุมัติเบิกค่าใช้จ่ายโครงการทิศทางแห่งเฟรชชี่ (The freshy bearing) สะสม.docx
@@ -289,7 +289,7 @@
         <w:ind w:left="-540"/>
         <w:jc w:val="center"/>
         <w:rPr>
-          <w:rFonts w:eastAsia="Times New Roman" w:hint="cs"/>
+          <w:rFonts w:eastAsia="Times New Roman"/>
           <w:color w:val="000000" w:themeColor="text1"/>
           <w:sz w:val="24"/>
           <w:szCs w:val="24"/>
@@ -4499,6 +4499,7 @@
                 <w:color w:val="000000" w:themeColor="text1"/>
                 <w:sz w:val="24"/>
                 <w:szCs w:val="24"/>
+                <w:highlight w:val="yellow"/>
               </w:rPr>
               <w:t>159,</w:t>
             </w:r>
@@ -4510,9 +4511,10 @@
                 <w:color w:val="000000" w:themeColor="text1"/>
                 <w:sz w:val="24"/>
                 <w:szCs w:val="24"/>
-                <w:cs/>
-              </w:rPr>
-              <w:t>185</w:t>
+                <w:highlight w:val="yellow"/>
+                <w:cs/>
+              </w:rPr>
+              <w:t>365</w:t>
             </w:r>
           </w:p>
         </w:tc>
@@ -4635,6 +4637,7 @@
                 <w:color w:val="000000" w:themeColor="text1"/>
                 <w:sz w:val="24"/>
                 <w:szCs w:val="24"/>
+                <w:highlight w:val="yellow"/>
               </w:rPr>
               <w:t>159,</w:t>
             </w:r>
@@ -4644,9 +4647,10 @@
                 <w:color w:val="000000" w:themeColor="text1"/>
                 <w:sz w:val="24"/>
                 <w:szCs w:val="24"/>
-                <w:cs/>
-              </w:rPr>
-              <w:t>185</w:t>
+                <w:highlight w:val="yellow"/>
+                <w:cs/>
+              </w:rPr>
+              <w:t>365</w:t>
             </w:r>
             <w:r>
               <w:rPr>
@@ -4674,6 +4678,7 @@
                 <w:color w:val="000000" w:themeColor="text1"/>
                 <w:sz w:val="24"/>
                 <w:szCs w:val="24"/>
+                <w:highlight w:val="yellow"/>
                 <w:cs/>
               </w:rPr>
               <w:t>(</w:t>
@@ -4684,26 +4689,29 @@
                 <w:color w:val="000000" w:themeColor="text1"/>
                 <w:sz w:val="24"/>
                 <w:szCs w:val="24"/>
-                <w:cs/>
-              </w:rPr>
-              <w:t>หนึ่งแสนห้าหมื่นเก้าพันหนึ่งร้อยแปดสิบห้า</w:t>
-            </w:r>
-            <w:r>
-              <w:rPr>
-                <w:rFonts w:hint="cs"/>
-                <w:color w:val="000000" w:themeColor="text1"/>
-                <w:sz w:val="24"/>
-                <w:szCs w:val="24"/>
-                <w:cs/>
-              </w:rPr>
-              <w:t>บาท</w:t>
-            </w:r>
-            <w:r>
-              <w:rPr>
-                <w:rFonts w:hint="cs"/>
-                <w:color w:val="000000" w:themeColor="text1"/>
-                <w:sz w:val="24"/>
-                <w:szCs w:val="24"/>
+                <w:highlight w:val="yellow"/>
+                <w:cs/>
+              </w:rPr>
+              <w:t>หนึ่งแสนห้าหมื่นเก้าพัน</w:t>
+            </w:r>
+            <w:r>
+              <w:rPr>
+                <w:rFonts w:hint="cs"/>
+                <w:color w:val="000000" w:themeColor="text1"/>
+                <w:sz w:val="24"/>
+                <w:szCs w:val="24"/>
+                <w:highlight w:val="yellow"/>
+                <w:cs/>
+              </w:rPr>
+              <w:t>สามร้อยหกสิบห้าบาท</w:t>
+            </w:r>
+            <w:r>
+              <w:rPr>
+                <w:rFonts w:hint="cs"/>
+                <w:color w:val="000000" w:themeColor="text1"/>
+                <w:sz w:val="24"/>
+                <w:szCs w:val="24"/>
+                <w:highlight w:val="yellow"/>
                 <w:cs/>
               </w:rPr>
               <w:t>ถ้วน)</w:t>

</xml_diff>